<commit_message>
Add new parameters in form
</commit_message>
<xml_diff>
--- a/WpfApp2/Form for print/Form.docx
+++ b/WpfApp2/Form for print/Form.docx
@@ -1,6 +1,6 @@
 
 <file path=word/document.xml><?xml version="1.0" encoding="utf-8"?>
-<w:document xmlns:wpc="http://schemas.microsoft.com/office/word/2010/wordprocessingCanvas" xmlns:mc="http://schemas.openxmlformats.org/markup-compatibility/2006" xmlns:o="urn:schemas-microsoft-com:office:office" xmlns:r="http://schemas.openxmlformats.org/officeDocument/2006/relationships" xmlns:m="http://schemas.openxmlformats.org/officeDocument/2006/math" xmlns:v="urn:schemas-microsoft-com:vml" xmlns:wp14="http://schemas.microsoft.com/office/word/2010/wordprocessingDrawing" xmlns:wp="http://schemas.openxmlformats.org/drawingml/2006/wordprocessingDrawing" xmlns:w10="urn:schemas-microsoft-com:office:word" xmlns:w="http://schemas.openxmlformats.org/wordprocessingml/2006/main" xmlns:w14="http://schemas.microsoft.com/office/word/2010/wordml" xmlns:w15="http://schemas.microsoft.com/office/word/2012/wordml" xmlns:wpg="http://schemas.microsoft.com/office/word/2010/wordprocessingGroup" xmlns:wpi="http://schemas.microsoft.com/office/word/2010/wordprocessingInk" xmlns:wne="http://schemas.microsoft.com/office/word/2006/wordml" xmlns:wps="http://schemas.microsoft.com/office/word/2010/wordprocessingShape" mc:Ignorable="w14 w15 wp14">
+<w:document xmlns:wpc="http://schemas.microsoft.com/office/word/2010/wordprocessingCanvas" xmlns:cx="http://schemas.microsoft.com/office/drawing/2014/chartex" xmlns:mc="http://schemas.openxmlformats.org/markup-compatibility/2006" xmlns:o="urn:schemas-microsoft-com:office:office" xmlns:r="http://schemas.openxmlformats.org/officeDocument/2006/relationships" xmlns:m="http://schemas.openxmlformats.org/officeDocument/2006/math" xmlns:v="urn:schemas-microsoft-com:vml" xmlns:wp14="http://schemas.microsoft.com/office/word/2010/wordprocessingDrawing" xmlns:wp="http://schemas.openxmlformats.org/drawingml/2006/wordprocessingDrawing" xmlns:w10="urn:schemas-microsoft-com:office:word" xmlns:w="http://schemas.openxmlformats.org/wordprocessingml/2006/main" xmlns:w14="http://schemas.microsoft.com/office/word/2010/wordml" xmlns:w15="http://schemas.microsoft.com/office/word/2012/wordml" xmlns:w16se="http://schemas.microsoft.com/office/word/2015/wordml/symex" xmlns:wpg="http://schemas.microsoft.com/office/word/2010/wordprocessingGroup" xmlns:wpi="http://schemas.microsoft.com/office/word/2010/wordprocessingInk" xmlns:wne="http://schemas.microsoft.com/office/word/2006/wordml" xmlns:wps="http://schemas.microsoft.com/office/word/2010/wordprocessingShape" mc:Ignorable="w14 w15 w16se wp14">
   <w:body>
     <w:p>
       <w:pPr>
@@ -557,10 +557,20 @@
         <w:rPr>
           <w:sz w:val="28"/>
           <w:szCs w:val="28"/>
-          <w:lang w:val="uk-UA"/>
+          <w:lang w:val="en-US"/>
         </w:rPr>
-        <w:t>___</w:t>
+        <w:t xml:space="preserve">  </w:t>
       </w:r>
+      <w:proofErr w:type="spellStart"/>
+      <w:r>
+        <w:rPr>
+          <w:sz w:val="28"/>
+          <w:szCs w:val="28"/>
+          <w:lang w:val="en-US"/>
+        </w:rPr>
+        <w:t>DateD</w:t>
+      </w:r>
+      <w:proofErr w:type="spellEnd"/>
       <w:r>
         <w:rPr>
           <w:sz w:val="28"/>
@@ -569,13 +579,43 @@
         </w:rPr>
         <w:t>.</w:t>
       </w:r>
+      <w:bookmarkStart w:id="0" w:name="_GoBack"/>
+      <w:bookmarkEnd w:id="0"/>
+      <w:proofErr w:type="spellStart"/>
+      <w:r>
+        <w:rPr>
+          <w:sz w:val="28"/>
+          <w:szCs w:val="28"/>
+          <w:lang w:val="en-US"/>
+        </w:rPr>
+        <w:t>DateM</w:t>
+      </w:r>
+      <w:proofErr w:type="spellEnd"/>
       <w:r>
         <w:rPr>
           <w:sz w:val="28"/>
           <w:szCs w:val="28"/>
           <w:lang w:val="uk-UA"/>
         </w:rPr>
-        <w:t>___</w:t>
+        <w:t>.</w:t>
+      </w:r>
+      <w:proofErr w:type="spellStart"/>
+      <w:r>
+        <w:rPr>
+          <w:sz w:val="28"/>
+          <w:szCs w:val="28"/>
+          <w:lang w:val="en-US"/>
+        </w:rPr>
+        <w:t>DateY</w:t>
+      </w:r>
+      <w:proofErr w:type="spellEnd"/>
+      <w:r>
+        <w:rPr>
+          <w:sz w:val="28"/>
+          <w:szCs w:val="28"/>
+          <w:lang w:val="uk-UA"/>
+        </w:rPr>
+        <w:t xml:space="preserve"> </w:t>
       </w:r>
       <w:r>
         <w:rPr>
@@ -583,23 +623,7 @@
           <w:szCs w:val="28"/>
           <w:lang w:val="uk-UA"/>
         </w:rPr>
-        <w:t>.20</w:t>
-      </w:r>
-      <w:r>
-        <w:rPr>
-          <w:sz w:val="28"/>
-          <w:szCs w:val="28"/>
-          <w:lang w:val="uk-UA"/>
-        </w:rPr>
-        <w:t>___</w:t>
-      </w:r>
-      <w:r>
-        <w:rPr>
-          <w:sz w:val="28"/>
-          <w:szCs w:val="28"/>
-          <w:lang w:val="uk-UA"/>
-        </w:rPr>
-        <w:t xml:space="preserve"> року</w:t>
+        <w:t>року</w:t>
       </w:r>
     </w:p>
     <w:p>
@@ -13780,7 +13804,6 @@
                 <w:szCs w:val="24"/>
               </w:rPr>
             </w:pPr>
-            <w:proofErr w:type="gramStart"/>
             <w:r>
               <w:rPr>
                 <w:sz w:val="24"/>
@@ -13788,7 +13811,6 @@
               </w:rPr>
               <w:t>номер</w:t>
             </w:r>
-            <w:proofErr w:type="gramEnd"/>
           </w:p>
         </w:tc>
         <w:tc>
@@ -13828,7 +13850,6 @@
               </w:rPr>
             </w:pPr>
             <w:proofErr w:type="spellStart"/>
-            <w:proofErr w:type="gramStart"/>
             <w:r>
               <w:rPr>
                 <w:sz w:val="24"/>
@@ -13837,7 +13858,6 @@
               <w:t>консервації</w:t>
             </w:r>
             <w:proofErr w:type="spellEnd"/>
-            <w:proofErr w:type="gramEnd"/>
           </w:p>
         </w:tc>
         <w:tc>
@@ -15126,21 +15146,12 @@
                 <w:szCs w:val="24"/>
               </w:rPr>
             </w:pPr>
-            <w:proofErr w:type="gramStart"/>
-            <w:r>
-              <w:rPr>
-                <w:sz w:val="24"/>
-                <w:szCs w:val="24"/>
-              </w:rPr>
-              <w:t>з</w:t>
-            </w:r>
-            <w:proofErr w:type="gramEnd"/>
-            <w:r>
-              <w:rPr>
-                <w:sz w:val="24"/>
-                <w:szCs w:val="24"/>
-              </w:rPr>
-              <w:t>/п</w:t>
+            <w:r>
+              <w:rPr>
+                <w:sz w:val="24"/>
+                <w:szCs w:val="24"/>
+              </w:rPr>
+              <w:t>з/п</w:t>
             </w:r>
           </w:p>
         </w:tc>
@@ -17297,21 +17308,12 @@
                 <w:szCs w:val="24"/>
               </w:rPr>
             </w:pPr>
-            <w:proofErr w:type="gramStart"/>
-            <w:r>
-              <w:rPr>
-                <w:sz w:val="24"/>
-                <w:szCs w:val="24"/>
-              </w:rPr>
-              <w:t>про</w:t>
-            </w:r>
-            <w:proofErr w:type="gramEnd"/>
-            <w:r>
-              <w:rPr>
-                <w:sz w:val="24"/>
-                <w:szCs w:val="24"/>
-              </w:rPr>
-              <w:t xml:space="preserve"> </w:t>
+            <w:r>
+              <w:rPr>
+                <w:sz w:val="24"/>
+                <w:szCs w:val="24"/>
+              </w:rPr>
+              <w:t xml:space="preserve">про </w:t>
             </w:r>
             <w:proofErr w:type="spellStart"/>
             <w:r>
@@ -17339,21 +17341,12 @@
                 <w:szCs w:val="24"/>
               </w:rPr>
             </w:pPr>
-            <w:proofErr w:type="gramStart"/>
-            <w:r>
-              <w:rPr>
-                <w:sz w:val="24"/>
-                <w:szCs w:val="24"/>
-              </w:rPr>
-              <w:t>про</w:t>
-            </w:r>
-            <w:proofErr w:type="gramEnd"/>
-            <w:r>
-              <w:rPr>
-                <w:sz w:val="24"/>
-                <w:szCs w:val="24"/>
-              </w:rPr>
-              <w:t xml:space="preserve"> </w:t>
+            <w:r>
+              <w:rPr>
+                <w:sz w:val="24"/>
+                <w:szCs w:val="24"/>
+              </w:rPr>
+              <w:t xml:space="preserve">про </w:t>
             </w:r>
             <w:proofErr w:type="spellStart"/>
             <w:r>
@@ -18584,21 +18577,12 @@
                 <w:szCs w:val="24"/>
               </w:rPr>
             </w:pPr>
-            <w:proofErr w:type="gramStart"/>
-            <w:r>
-              <w:rPr>
-                <w:sz w:val="24"/>
-                <w:szCs w:val="24"/>
-              </w:rPr>
-              <w:t>про</w:t>
-            </w:r>
-            <w:proofErr w:type="gramEnd"/>
-            <w:r>
-              <w:rPr>
-                <w:sz w:val="24"/>
-                <w:szCs w:val="24"/>
-              </w:rPr>
-              <w:t xml:space="preserve"> </w:t>
+            <w:r>
+              <w:rPr>
+                <w:sz w:val="24"/>
+                <w:szCs w:val="24"/>
+              </w:rPr>
+              <w:t xml:space="preserve">про </w:t>
             </w:r>
             <w:proofErr w:type="spellStart"/>
             <w:r>
@@ -18626,21 +18610,12 @@
                 <w:szCs w:val="24"/>
               </w:rPr>
             </w:pPr>
-            <w:proofErr w:type="gramStart"/>
-            <w:r>
-              <w:rPr>
-                <w:sz w:val="24"/>
-                <w:szCs w:val="24"/>
-              </w:rPr>
-              <w:t>про</w:t>
-            </w:r>
-            <w:proofErr w:type="gramEnd"/>
-            <w:r>
-              <w:rPr>
-                <w:sz w:val="24"/>
-                <w:szCs w:val="24"/>
-              </w:rPr>
-              <w:t xml:space="preserve"> </w:t>
+            <w:r>
+              <w:rPr>
+                <w:sz w:val="24"/>
+                <w:szCs w:val="24"/>
+              </w:rPr>
+              <w:t xml:space="preserve">про </w:t>
             </w:r>
             <w:proofErr w:type="spellStart"/>
             <w:r>
@@ -42166,21 +42141,12 @@
                 <w:szCs w:val="24"/>
               </w:rPr>
             </w:pPr>
-            <w:proofErr w:type="gramStart"/>
-            <w:r>
-              <w:rPr>
-                <w:sz w:val="24"/>
-                <w:szCs w:val="24"/>
-              </w:rPr>
-              <w:t>з</w:t>
-            </w:r>
-            <w:proofErr w:type="gramEnd"/>
-            <w:r>
-              <w:rPr>
-                <w:sz w:val="24"/>
-                <w:szCs w:val="24"/>
-              </w:rPr>
-              <w:t>/п</w:t>
+            <w:r>
+              <w:rPr>
+                <w:sz w:val="24"/>
+                <w:szCs w:val="24"/>
+              </w:rPr>
+              <w:t>з/п</w:t>
             </w:r>
           </w:p>
         </w:tc>
@@ -49878,21 +49844,12 @@
                 <w:szCs w:val="24"/>
               </w:rPr>
             </w:pPr>
-            <w:proofErr w:type="gramStart"/>
-            <w:r>
-              <w:rPr>
-                <w:sz w:val="24"/>
-                <w:szCs w:val="24"/>
-              </w:rPr>
-              <w:t>яка</w:t>
-            </w:r>
-            <w:proofErr w:type="gramEnd"/>
-            <w:r>
-              <w:rPr>
-                <w:sz w:val="24"/>
-                <w:szCs w:val="24"/>
-              </w:rPr>
-              <w:t xml:space="preserve"> </w:t>
+            <w:r>
+              <w:rPr>
+                <w:sz w:val="24"/>
+                <w:szCs w:val="24"/>
+              </w:rPr>
+              <w:t xml:space="preserve">яка </w:t>
             </w:r>
             <w:proofErr w:type="spellStart"/>
             <w:r>
@@ -50181,7 +50138,6 @@
               </w:rPr>
             </w:pPr>
             <w:proofErr w:type="spellStart"/>
-            <w:proofErr w:type="gramStart"/>
             <w:r>
               <w:rPr>
                 <w:sz w:val="24"/>
@@ -50190,7 +50146,6 @@
               <w:t>номінальне</w:t>
             </w:r>
             <w:proofErr w:type="spellEnd"/>
-            <w:proofErr w:type="gramEnd"/>
           </w:p>
         </w:tc>
         <w:tc>
@@ -50208,21 +50163,12 @@
                 <w:szCs w:val="24"/>
               </w:rPr>
             </w:pPr>
-            <w:proofErr w:type="gramStart"/>
-            <w:r>
-              <w:rPr>
-                <w:sz w:val="24"/>
-                <w:szCs w:val="24"/>
-              </w:rPr>
-              <w:t>граничного</w:t>
-            </w:r>
-            <w:proofErr w:type="gramEnd"/>
-            <w:r>
-              <w:rPr>
-                <w:sz w:val="24"/>
-                <w:szCs w:val="24"/>
-              </w:rPr>
-              <w:t xml:space="preserve"> </w:t>
+            <w:r>
+              <w:rPr>
+                <w:sz w:val="24"/>
+                <w:szCs w:val="24"/>
+              </w:rPr>
+              <w:t xml:space="preserve">граничного </w:t>
             </w:r>
             <w:proofErr w:type="spellStart"/>
             <w:r>
@@ -50252,7 +50198,6 @@
               </w:rPr>
             </w:pPr>
             <w:proofErr w:type="spellStart"/>
-            <w:proofErr w:type="gramStart"/>
             <w:r>
               <w:rPr>
                 <w:sz w:val="24"/>
@@ -50261,7 +50206,6 @@
               <w:t>фактично</w:t>
             </w:r>
             <w:proofErr w:type="spellEnd"/>
-            <w:proofErr w:type="gramEnd"/>
           </w:p>
         </w:tc>
         <w:tc>
@@ -50281,7 +50225,6 @@
               </w:rPr>
             </w:pPr>
             <w:proofErr w:type="spellStart"/>
-            <w:proofErr w:type="gramStart"/>
             <w:r>
               <w:rPr>
                 <w:sz w:val="24"/>
@@ -50290,7 +50233,6 @@
               <w:t>заміряв</w:t>
             </w:r>
             <w:proofErr w:type="spellEnd"/>
-            <w:proofErr w:type="gramEnd"/>
             <w:r>
               <w:rPr>
                 <w:sz w:val="24"/>
@@ -50333,7 +50275,6 @@
               </w:rPr>
             </w:pPr>
             <w:proofErr w:type="spellStart"/>
-            <w:proofErr w:type="gramStart"/>
             <w:r>
               <w:rPr>
                 <w:sz w:val="24"/>
@@ -50342,7 +50283,6 @@
               <w:t>фактично</w:t>
             </w:r>
             <w:proofErr w:type="spellEnd"/>
-            <w:proofErr w:type="gramEnd"/>
           </w:p>
         </w:tc>
         <w:tc>
@@ -50362,7 +50302,6 @@
               </w:rPr>
             </w:pPr>
             <w:proofErr w:type="spellStart"/>
-            <w:proofErr w:type="gramStart"/>
             <w:r>
               <w:rPr>
                 <w:sz w:val="24"/>
@@ -50371,7 +50310,6 @@
               <w:t>заміряв</w:t>
             </w:r>
             <w:proofErr w:type="spellEnd"/>
-            <w:proofErr w:type="gramEnd"/>
             <w:r>
               <w:rPr>
                 <w:sz w:val="24"/>
@@ -50414,7 +50352,6 @@
               </w:rPr>
             </w:pPr>
             <w:proofErr w:type="spellStart"/>
-            <w:proofErr w:type="gramStart"/>
             <w:r>
               <w:rPr>
                 <w:sz w:val="24"/>
@@ -50423,7 +50360,6 @@
               <w:t>фактично</w:t>
             </w:r>
             <w:proofErr w:type="spellEnd"/>
-            <w:proofErr w:type="gramEnd"/>
           </w:p>
         </w:tc>
         <w:tc>
@@ -50442,7 +50378,6 @@
               </w:rPr>
             </w:pPr>
             <w:proofErr w:type="spellStart"/>
-            <w:proofErr w:type="gramStart"/>
             <w:r>
               <w:rPr>
                 <w:sz w:val="24"/>
@@ -50451,7 +50386,6 @@
               <w:t>заміряв</w:t>
             </w:r>
             <w:proofErr w:type="spellEnd"/>
-            <w:proofErr w:type="gramEnd"/>
             <w:r>
               <w:rPr>
                 <w:sz w:val="24"/>
@@ -54976,7 +54910,6 @@
               </w:rPr>
             </w:pPr>
             <w:proofErr w:type="spellStart"/>
-            <w:proofErr w:type="gramStart"/>
             <w:r>
               <w:rPr>
                 <w:sz w:val="24"/>
@@ -54985,7 +54918,6 @@
               <w:t>заводський</w:t>
             </w:r>
             <w:proofErr w:type="spellEnd"/>
-            <w:proofErr w:type="gramEnd"/>
             <w:r>
               <w:rPr>
                 <w:sz w:val="24"/>
@@ -55013,7 +54945,6 @@
               </w:rPr>
             </w:pPr>
             <w:proofErr w:type="spellStart"/>
-            <w:proofErr w:type="gramStart"/>
             <w:r>
               <w:rPr>
                 <w:sz w:val="24"/>
@@ -55022,7 +54953,6 @@
               <w:t>кількість</w:t>
             </w:r>
             <w:proofErr w:type="spellEnd"/>
-            <w:proofErr w:type="gramEnd"/>
             <w:r>
               <w:rPr>
                 <w:sz w:val="24"/>
@@ -55173,7 +55103,6 @@
               </w:rPr>
             </w:pPr>
             <w:proofErr w:type="spellStart"/>
-            <w:proofErr w:type="gramStart"/>
             <w:r>
               <w:rPr>
                 <w:sz w:val="24"/>
@@ -55182,7 +55111,6 @@
               <w:t>заводський</w:t>
             </w:r>
             <w:proofErr w:type="spellEnd"/>
-            <w:proofErr w:type="gramEnd"/>
             <w:r>
               <w:rPr>
                 <w:sz w:val="24"/>
@@ -62145,15 +62073,7 @@
                 <w:sz w:val="24"/>
                 <w:szCs w:val="24"/>
               </w:rPr>
-              <w:t xml:space="preserve"> </w:t>
-            </w:r>
-            <w:proofErr w:type="gramStart"/>
-            <w:r>
-              <w:rPr>
-                <w:sz w:val="24"/>
-                <w:szCs w:val="24"/>
-              </w:rPr>
-              <w:t xml:space="preserve">годин  </w:t>
+              <w:t xml:space="preserve"> годин  </w:t>
             </w:r>
             <w:proofErr w:type="spellStart"/>
             <w:r>
@@ -62164,7 +62084,6 @@
               <w:t>напрацювання</w:t>
             </w:r>
             <w:proofErr w:type="spellEnd"/>
-            <w:proofErr w:type="gramEnd"/>
             <w:r>
               <w:rPr>
                 <w:sz w:val="24"/>
@@ -62414,7 +62333,6 @@
               </w:rPr>
             </w:pPr>
             <w:proofErr w:type="spellStart"/>
-            <w:proofErr w:type="gramStart"/>
             <w:r>
               <w:rPr>
                 <w:sz w:val="24"/>
@@ -62423,7 +62341,6 @@
               <w:t>надходження</w:t>
             </w:r>
             <w:proofErr w:type="spellEnd"/>
-            <w:proofErr w:type="gramEnd"/>
             <w:r>
               <w:rPr>
                 <w:sz w:val="24"/>
@@ -62451,7 +62368,6 @@
               </w:rPr>
             </w:pPr>
             <w:proofErr w:type="spellStart"/>
-            <w:proofErr w:type="gramStart"/>
             <w:r>
               <w:rPr>
                 <w:sz w:val="24"/>
@@ -62465,15 +62381,7 @@
                 <w:sz w:val="24"/>
                 <w:szCs w:val="24"/>
               </w:rPr>
-              <w:t xml:space="preserve">  з</w:t>
-            </w:r>
-            <w:proofErr w:type="gramEnd"/>
-            <w:r>
-              <w:rPr>
-                <w:sz w:val="24"/>
-                <w:szCs w:val="24"/>
-              </w:rPr>
-              <w:t xml:space="preserve"> ремонту</w:t>
+              <w:t xml:space="preserve">  з ремонту</w:t>
             </w:r>
           </w:p>
         </w:tc>
@@ -62571,21 +62479,12 @@
                 <w:szCs w:val="24"/>
               </w:rPr>
             </w:pPr>
-            <w:proofErr w:type="gramStart"/>
-            <w:r>
-              <w:rPr>
-                <w:sz w:val="24"/>
-                <w:szCs w:val="24"/>
-              </w:rPr>
-              <w:t>яка</w:t>
-            </w:r>
-            <w:proofErr w:type="gramEnd"/>
-            <w:r>
-              <w:rPr>
-                <w:sz w:val="24"/>
-                <w:szCs w:val="24"/>
-              </w:rPr>
-              <w:t xml:space="preserve"> проводила ремонт</w:t>
+            <w:r>
+              <w:rPr>
+                <w:sz w:val="24"/>
+                <w:szCs w:val="24"/>
+              </w:rPr>
+              <w:t>яка проводила ремонт</w:t>
             </w:r>
           </w:p>
         </w:tc>
@@ -62607,21 +62506,12 @@
                 <w:szCs w:val="24"/>
               </w:rPr>
             </w:pPr>
-            <w:proofErr w:type="gramStart"/>
-            <w:r>
-              <w:rPr>
-                <w:sz w:val="24"/>
-                <w:szCs w:val="24"/>
-              </w:rPr>
-              <w:t>яка</w:t>
-            </w:r>
-            <w:proofErr w:type="gramEnd"/>
-            <w:r>
-              <w:rPr>
-                <w:sz w:val="24"/>
-                <w:szCs w:val="24"/>
-              </w:rPr>
-              <w:t xml:space="preserve"> </w:t>
+            <w:r>
+              <w:rPr>
+                <w:sz w:val="24"/>
+                <w:szCs w:val="24"/>
+              </w:rPr>
+              <w:t xml:space="preserve">яка </w:t>
             </w:r>
             <w:proofErr w:type="spellStart"/>
             <w:r>
@@ -68971,8 +68861,6 @@
         </w:rPr>
         <w:t xml:space="preserve"> AdditionalInfo</w:t>
       </w:r>
-      <w:bookmarkStart w:id="0" w:name="_GoBack"/>
-      <w:bookmarkEnd w:id="0"/>
       <w:r>
         <w:rPr>
           <w:sz w:val="28"/>
@@ -69170,8 +69058,8 @@
 </file>
 
 <file path=word/numbering.xml><?xml version="1.0" encoding="utf-8"?>
-<w:numbering xmlns:wpc="http://schemas.microsoft.com/office/word/2010/wordprocessingCanvas" xmlns:mc="http://schemas.openxmlformats.org/markup-compatibility/2006" xmlns:o="urn:schemas-microsoft-com:office:office" xmlns:r="http://schemas.openxmlformats.org/officeDocument/2006/relationships" xmlns:m="http://schemas.openxmlformats.org/officeDocument/2006/math" xmlns:v="urn:schemas-microsoft-com:vml" xmlns:wp14="http://schemas.microsoft.com/office/word/2010/wordprocessingDrawing" xmlns:wp="http://schemas.openxmlformats.org/drawingml/2006/wordprocessingDrawing" xmlns:w10="urn:schemas-microsoft-com:office:word" xmlns:w="http://schemas.openxmlformats.org/wordprocessingml/2006/main" xmlns:w14="http://schemas.microsoft.com/office/word/2010/wordml" xmlns:w15="http://schemas.microsoft.com/office/word/2012/wordml" xmlns:wpg="http://schemas.microsoft.com/office/word/2010/wordprocessingGroup" xmlns:wpi="http://schemas.microsoft.com/office/word/2010/wordprocessingInk" xmlns:wne="http://schemas.microsoft.com/office/word/2006/wordml" xmlns:wps="http://schemas.microsoft.com/office/word/2010/wordprocessingShape" mc:Ignorable="w14 w15 wp14">
-  <w:abstractNum w:abstractNumId="0">
+<w:numbering xmlns:wpc="http://schemas.microsoft.com/office/word/2010/wordprocessingCanvas" xmlns:cx="http://schemas.microsoft.com/office/drawing/2014/chartex" xmlns:mc="http://schemas.openxmlformats.org/markup-compatibility/2006" xmlns:o="urn:schemas-microsoft-com:office:office" xmlns:r="http://schemas.openxmlformats.org/officeDocument/2006/relationships" xmlns:m="http://schemas.openxmlformats.org/officeDocument/2006/math" xmlns:v="urn:schemas-microsoft-com:vml" xmlns:wp14="http://schemas.microsoft.com/office/word/2010/wordprocessingDrawing" xmlns:wp="http://schemas.openxmlformats.org/drawingml/2006/wordprocessingDrawing" xmlns:w10="urn:schemas-microsoft-com:office:word" xmlns:w="http://schemas.openxmlformats.org/wordprocessingml/2006/main" xmlns:w14="http://schemas.microsoft.com/office/word/2010/wordml" xmlns:w15="http://schemas.microsoft.com/office/word/2012/wordml" xmlns:w16se="http://schemas.microsoft.com/office/word/2015/wordml/symex" xmlns:wpg="http://schemas.microsoft.com/office/word/2010/wordprocessingGroup" xmlns:wpi="http://schemas.microsoft.com/office/word/2010/wordprocessingInk" xmlns:wne="http://schemas.microsoft.com/office/word/2006/wordml" xmlns:wps="http://schemas.microsoft.com/office/word/2010/wordprocessingShape" mc:Ignorable="w14 w15 w16se wp14">
+  <w:abstractNum w:abstractNumId="0" w15:restartNumberingAfterBreak="0">
     <w:nsid w:val="09496D36"/>
     <w:multiLevelType w:val="multilevel"/>
     <w:tmpl w:val="3AC4E0F4"/>
@@ -69287,7 +69175,7 @@
       </w:pPr>
     </w:lvl>
   </w:abstractNum>
-  <w:abstractNum w:abstractNumId="1">
+  <w:abstractNum w:abstractNumId="1" w15:restartNumberingAfterBreak="0">
     <w:nsid w:val="341E240F"/>
     <w:multiLevelType w:val="singleLevel"/>
     <w:tmpl w:val="09FEB4D4"/>
@@ -69307,7 +69195,7 @@
       </w:rPr>
     </w:lvl>
   </w:abstractNum>
-  <w:abstractNum w:abstractNumId="2">
+  <w:abstractNum w:abstractNumId="2" w15:restartNumberingAfterBreak="0">
     <w:nsid w:val="57E11F1F"/>
     <w:multiLevelType w:val="hybridMultilevel"/>
     <w:tmpl w:val="4A064D3E"/>
@@ -69423,7 +69311,7 @@
       </w:pPr>
     </w:lvl>
   </w:abstractNum>
-  <w:abstractNum w:abstractNumId="3">
+  <w:abstractNum w:abstractNumId="3" w15:restartNumberingAfterBreak="0">
     <w:nsid w:val="77A5537A"/>
     <w:multiLevelType w:val="hybridMultilevel"/>
     <w:tmpl w:val="B9F2FFDA"/>
@@ -69528,7 +69416,7 @@
 </file>
 
 <file path=word/styles.xml><?xml version="1.0" encoding="utf-8"?>
-<w:styles xmlns:mc="http://schemas.openxmlformats.org/markup-compatibility/2006" xmlns:r="http://schemas.openxmlformats.org/officeDocument/2006/relationships" xmlns:w="http://schemas.openxmlformats.org/wordprocessingml/2006/main" xmlns:w14="http://schemas.microsoft.com/office/word/2010/wordml" xmlns:w15="http://schemas.microsoft.com/office/word/2012/wordml" mc:Ignorable="w14 w15">
+<w:styles xmlns:mc="http://schemas.openxmlformats.org/markup-compatibility/2006" xmlns:r="http://schemas.openxmlformats.org/officeDocument/2006/relationships" xmlns:w="http://schemas.openxmlformats.org/wordprocessingml/2006/main" xmlns:w14="http://schemas.microsoft.com/office/word/2010/wordml" xmlns:w15="http://schemas.microsoft.com/office/word/2012/wordml" xmlns:w16se="http://schemas.microsoft.com/office/word/2015/wordml/symex" mc:Ignorable="w14 w15 w16se">
   <w:docDefaults>
     <w:rPrDefault>
       <w:rPr>
@@ -70082,7 +69970,7 @@
     </w:rPr>
   </w:style>
   <w:style w:type="character" w:customStyle="1" w:styleId="a5">
-    <w:name w:val="Название Знак"/>
+    <w:name w:val="Назва Знак"/>
     <w:basedOn w:val="a0"/>
     <w:link w:val="a4"/>
     <w:rsid w:val="009500BC"/>
@@ -70126,7 +70014,7 @@
     </w:pPr>
   </w:style>
   <w:style w:type="character" w:customStyle="1" w:styleId="a9">
-    <w:name w:val="Основной текст с отступом Знак"/>
+    <w:name w:val="Основний текст з відступом Знак"/>
     <w:basedOn w:val="a0"/>
     <w:link w:val="a8"/>
     <w:rsid w:val="009500BC"/>
@@ -70148,7 +70036,7 @@
     </w:pPr>
   </w:style>
   <w:style w:type="character" w:customStyle="1" w:styleId="22">
-    <w:name w:val="Основной текст с отступом 2 Знак"/>
+    <w:name w:val="Основний текст з відступом 2 Знак"/>
     <w:basedOn w:val="a0"/>
     <w:link w:val="21"/>
     <w:rsid w:val="009500BC"/>
@@ -70187,7 +70075,7 @@
     </w:rPr>
   </w:style>
   <w:style w:type="character" w:customStyle="1" w:styleId="ab">
-    <w:name w:val="Текст выноски Знак"/>
+    <w:name w:val="Текст у виносці Знак"/>
     <w:basedOn w:val="a0"/>
     <w:link w:val="aa"/>
     <w:uiPriority w:val="99"/>
@@ -70469,7 +70357,7 @@
 </file>
 
 <file path=customXml/itemProps1.xml><?xml version="1.0" encoding="utf-8"?>
-<ds:datastoreItem xmlns:ds="http://schemas.openxmlformats.org/officeDocument/2006/customXml" ds:itemID="{4DC170CA-E09F-4A09-99BA-B4F1F4100CD8}">
+<ds:datastoreItem xmlns:ds="http://schemas.openxmlformats.org/officeDocument/2006/customXml" ds:itemID="{A815C2AA-55F5-4809-AE33-E9A34195B3DD}">
   <ds:schemaRefs>
     <ds:schemaRef ds:uri="http://schemas.openxmlformats.org/officeDocument/2006/bibliography"/>
   </ds:schemaRefs>

</xml_diff>